<commit_message>
Refactor project to Sunset Bistro branding: Updated chatbot API, frontend components, and documentation to reflect Sunset Bistro's identity. Enhanced system prompt for customer service interactions and added comprehensive knowledge base for restaurant details. Removed Tacos Azteca references throughout the codebase.
</commit_message>
<xml_diff>
--- a/TACOS AZTECA_1.docx
+++ b/TACOS AZTECA_1.docx
@@ -3,1527 +3,14 @@
 <w:document xmlns:wpc="http://schemas.microsoft.com/office/word/2010/wordprocessingCanvas" xmlns:cx="http://schemas.microsoft.com/office/drawing/2014/chartex" xmlns:cx1="http://schemas.microsoft.com/office/drawing/2015/9/8/chartex" xmlns:cx2="http://schemas.microsoft.com/office/drawing/2015/10/21/chartex" xmlns:cx3="http://schemas.microsoft.com/office/drawing/2016/5/9/chartex" xmlns:cx4="http://schemas.microsoft.com/office/drawing/2016/5/10/chartex" xmlns:cx5="http://schemas.microsoft.com/office/drawing/2016/5/11/chartex" xmlns:cx6="http://schemas.microsoft.com/office/drawing/2016/5/12/chartex" xmlns:cx7="http://schemas.microsoft.com/office/drawing/2016/5/13/chartex" xmlns:cx8="http://schemas.microsoft.com/office/drawing/2016/5/14/chartex" xmlns:mc="http://schemas.openxmlformats.org/markup-compatibility/2006" xmlns:aink="http://schemas.microsoft.com/office/drawing/2016/ink" xmlns:am3d="http://schemas.microsoft.com/office/drawing/2017/model3d" xmlns:o="urn:schemas-microsoft-com:office:office" xmlns:oel="http://schemas.microsoft.com/office/2019/extlst" xmlns:r="http://schemas.openxmlformats.org/officeDocument/2006/relationships" xmlns:m="http://schemas.openxmlformats.org/officeDocument/2006/math" xmlns:v="urn:schemas-microsoft-com:vml" xmlns:wp14="http://schemas.microsoft.com/office/word/2010/wordprocessingDrawing" xmlns:wp="http://schemas.openxmlformats.org/drawingml/2006/wordprocessingDrawing" xmlns:w10="urn:schemas-microsoft-com:office:word" xmlns:w="http://schemas.openxmlformats.org/wordprocessingml/2006/main" xmlns:w14="http://schemas.microsoft.com/office/word/2010/wordml" xmlns:w15="http://schemas.microsoft.com/office/word/2012/wordml" xmlns:w16cex="http://schemas.microsoft.com/office/word/2018/wordml/cex" xmlns:w16cid="http://schemas.microsoft.com/office/word/2016/wordml/cid" xmlns:w16="http://schemas.microsoft.com/office/word/2018/wordml" xmlns:w16du="http://schemas.microsoft.com/office/word/2023/wordml/word16du" xmlns:w16sdtdh="http://schemas.microsoft.com/office/word/2020/wordml/sdtdatahash" xmlns:w16sdtfl="http://schemas.microsoft.com/office/word/2024/wordml/sdtformatlock" xmlns:w16se="http://schemas.microsoft.com/office/word/2015/wordml/symex" xmlns:wpg="http://schemas.microsoft.com/office/word/2010/wordprocessingGroup" xmlns:wpi="http://schemas.microsoft.com/office/word/2010/wordprocessingInk" xmlns:wne="http://schemas.microsoft.com/office/word/2006/wordml" xmlns:wps="http://schemas.microsoft.com/office/word/2010/wordprocessingShape" mc:Ignorable="w14 w15 w16se w16cid w16 w16cex w16sdtdh w16sdtfl w16du wp14">
   <w:body>
     <w:p>
-      <w:pPr>
-        <w:rPr>
-          <w:b/>
-          <w:bCs/>
-        </w:rPr>
-      </w:pPr>
       <w:r>
         <w:rPr>
           <w:b/>
           <w:bCs/>
         </w:rPr>
-        <w:t>TACOS AZTECA (Sunnyvale, CA)</w:t>
+        <w:t>a</w:t>
       </w:r>
     </w:p>
-    <w:p>
-      <w:pPr>
-        <w:rPr>
-          <w:b/>
-          <w:bCs/>
-        </w:rPr>
-      </w:pPr>
-      <w:r>
-        <w:rPr>
-          <w:b/>
-          <w:bCs/>
-        </w:rPr>
-        <w:t>Location &amp; Contact</w:t>
-      </w:r>
-    </w:p>
-    <w:p>
-      <w:pPr>
-        <w:numPr>
-          <w:ilvl w:val="0"/>
-          <w:numId w:val="30"/>
-        </w:numPr>
-      </w:pPr>
-      <w:r>
-        <w:rPr>
-          <w:b/>
-          <w:bCs/>
-        </w:rPr>
-        <w:t>Address:</w:t>
-      </w:r>
-      <w:r>
-        <w:t xml:space="preserve"> 1300 Sunnyvale Saratoga Road, Sunnyvale, CA 94087, USA</w:t>
-      </w:r>
-    </w:p>
-    <w:p>
-      <w:pPr>
-        <w:numPr>
-          <w:ilvl w:val="0"/>
-          <w:numId w:val="30"/>
-        </w:numPr>
-      </w:pPr>
-      <w:r>
-        <w:rPr>
-          <w:b/>
-          <w:bCs/>
-        </w:rPr>
-        <w:t>Phone:</w:t>
-      </w:r>
-      <w:r>
-        <w:t xml:space="preserve"> 669-225-8024</w:t>
-      </w:r>
-    </w:p>
-    <w:p>
-      <w:pPr>
-        <w:numPr>
-          <w:ilvl w:val="0"/>
-          <w:numId w:val="30"/>
-        </w:numPr>
-      </w:pPr>
-      <w:r>
-        <w:rPr>
-          <w:b/>
-          <w:bCs/>
-        </w:rPr>
-        <w:t>Social:</w:t>
-      </w:r>
-    </w:p>
-    <w:p>
-      <w:pPr>
-        <w:numPr>
-          <w:ilvl w:val="1"/>
-          <w:numId w:val="30"/>
-        </w:numPr>
-      </w:pPr>
-      <w:proofErr w:type="gramStart"/>
-      <w:r>
-        <w:t>Instagram: @</w:t>
-      </w:r>
-      <w:proofErr w:type="gramEnd"/>
-      <w:r>
-        <w:t>tacos_azteca</w:t>
-      </w:r>
-    </w:p>
-    <w:p>
-      <w:pPr>
-        <w:numPr>
-          <w:ilvl w:val="1"/>
-          <w:numId w:val="30"/>
-        </w:numPr>
-      </w:pPr>
-      <w:r>
-        <w:t xml:space="preserve">Facebook: </w:t>
-      </w:r>
-      <w:proofErr w:type="spellStart"/>
-      <w:r>
-        <w:t>TaacosAztecaa</w:t>
-      </w:r>
-      <w:proofErr w:type="spellEnd"/>
-    </w:p>
-    <w:p>
-      <w:pPr>
-        <w:numPr>
-          <w:ilvl w:val="1"/>
-          <w:numId w:val="30"/>
-        </w:numPr>
-      </w:pPr>
-      <w:proofErr w:type="gramStart"/>
-      <w:r>
-        <w:t>TikTok: @</w:t>
-      </w:r>
-      <w:proofErr w:type="gramEnd"/>
-      <w:r>
-        <w:t>tacos_azteca</w:t>
-      </w:r>
-    </w:p>
-    <w:p>
-      <w:pPr>
-        <w:rPr>
-          <w:b/>
-          <w:bCs/>
-        </w:rPr>
-      </w:pPr>
-      <w:r>
-        <w:rPr>
-          <w:b/>
-          <w:bCs/>
-        </w:rPr>
-        <w:t>Menu Overview</w:t>
-      </w:r>
-    </w:p>
-    <w:p>
-      <w:pPr>
-        <w:numPr>
-          <w:ilvl w:val="0"/>
-          <w:numId w:val="31"/>
-        </w:numPr>
-      </w:pPr>
-      <w:proofErr w:type="spellStart"/>
-      <w:r>
-        <w:t>Quesabirrias</w:t>
-      </w:r>
-      <w:proofErr w:type="spellEnd"/>
-    </w:p>
-    <w:p>
-      <w:pPr>
-        <w:numPr>
-          <w:ilvl w:val="0"/>
-          <w:numId w:val="31"/>
-        </w:numPr>
-      </w:pPr>
-      <w:r>
-        <w:t>Carne Asada Tacos</w:t>
-      </w:r>
-    </w:p>
-    <w:p>
-      <w:pPr>
-        <w:numPr>
-          <w:ilvl w:val="0"/>
-          <w:numId w:val="31"/>
-        </w:numPr>
-      </w:pPr>
-      <w:r>
-        <w:t>Burritos Al Pastor</w:t>
-      </w:r>
-    </w:p>
-    <w:p>
-      <w:pPr>
-        <w:numPr>
-          <w:ilvl w:val="0"/>
-          <w:numId w:val="31"/>
-        </w:numPr>
-      </w:pPr>
-      <w:r>
-        <w:t>Pollo (Chicken) Tacos</w:t>
-      </w:r>
-    </w:p>
-    <w:p>
-      <w:pPr>
-        <w:numPr>
-          <w:ilvl w:val="0"/>
-          <w:numId w:val="31"/>
-        </w:numPr>
-      </w:pPr>
-      <w:r>
-        <w:t>Birria Burrito</w:t>
-      </w:r>
-    </w:p>
-    <w:p>
-      <w:pPr>
-        <w:numPr>
-          <w:ilvl w:val="0"/>
-          <w:numId w:val="31"/>
-        </w:numPr>
-      </w:pPr>
-      <w:r>
-        <w:t>Veggie Taco</w:t>
-      </w:r>
-    </w:p>
-    <w:p>
-      <w:pPr>
-        <w:numPr>
-          <w:ilvl w:val="0"/>
-          <w:numId w:val="31"/>
-        </w:numPr>
-      </w:pPr>
-      <w:r>
-        <w:t>Super Burrito</w:t>
-      </w:r>
-    </w:p>
-    <w:p>
-      <w:pPr>
-        <w:numPr>
-          <w:ilvl w:val="0"/>
-          <w:numId w:val="31"/>
-        </w:numPr>
-      </w:pPr>
-      <w:proofErr w:type="spellStart"/>
-      <w:r>
-        <w:t>Milanesa</w:t>
-      </w:r>
-      <w:proofErr w:type="spellEnd"/>
-      <w:r>
-        <w:t xml:space="preserve"> Taco &amp; Burrito</w:t>
-      </w:r>
-    </w:p>
-    <w:p>
-      <w:pPr>
-        <w:numPr>
-          <w:ilvl w:val="0"/>
-          <w:numId w:val="31"/>
-        </w:numPr>
-      </w:pPr>
-      <w:r>
-        <w:t>Quesadilla</w:t>
-      </w:r>
-    </w:p>
-    <w:p>
-      <w:pPr>
-        <w:numPr>
-          <w:ilvl w:val="0"/>
-          <w:numId w:val="31"/>
-        </w:numPr>
-      </w:pPr>
-      <w:r>
-        <w:t>Torta</w:t>
-      </w:r>
-    </w:p>
-    <w:p>
-      <w:pPr>
-        <w:numPr>
-          <w:ilvl w:val="0"/>
-          <w:numId w:val="31"/>
-        </w:numPr>
-      </w:pPr>
-      <w:r>
-        <w:t>Special Lunch (3 tacos + rice &amp; beans; meats: fried pork, chicken, beef, marinated pork)</w:t>
-      </w:r>
-    </w:p>
-    <w:p>
-      <w:pPr>
-        <w:numPr>
-          <w:ilvl w:val="0"/>
-          <w:numId w:val="31"/>
-        </w:numPr>
-      </w:pPr>
-      <w:r>
-        <w:t>Horchata / Aguas Frescas</w:t>
-      </w:r>
-    </w:p>
-    <w:p>
-      <w:pPr>
-        <w:rPr>
-          <w:b/>
-          <w:bCs/>
-        </w:rPr>
-      </w:pPr>
-      <w:r>
-        <w:rPr>
-          <w:b/>
-          <w:bCs/>
-        </w:rPr>
-        <w:t>Brand Message</w:t>
-      </w:r>
-    </w:p>
-    <w:p>
-      <w:pPr>
-        <w:numPr>
-          <w:ilvl w:val="0"/>
-          <w:numId w:val="32"/>
-        </w:numPr>
-      </w:pPr>
-      <w:r>
-        <w:t>“We don’t just serve tacos — We serve happiness wrapped in a tortilla!”</w:t>
-      </w:r>
-    </w:p>
-    <w:p>
-      <w:pPr>
-        <w:numPr>
-          <w:ilvl w:val="0"/>
-          <w:numId w:val="32"/>
-        </w:numPr>
-      </w:pPr>
-      <w:r>
-        <w:t>Focus on authentic Mexican heritage dishes.</w:t>
-      </w:r>
-    </w:p>
-    <w:p>
-      <w:pPr>
-        <w:rPr>
-          <w:b/>
-          <w:bCs/>
-        </w:rPr>
-      </w:pPr>
-      <w:r>
-        <w:rPr>
-          <w:b/>
-          <w:bCs/>
-        </w:rPr>
-        <w:t>Company Info</w:t>
-      </w:r>
-    </w:p>
-    <w:p>
-      <w:pPr>
-        <w:numPr>
-          <w:ilvl w:val="0"/>
-          <w:numId w:val="33"/>
-        </w:numPr>
-      </w:pPr>
-      <w:r>
-        <w:t xml:space="preserve">Website built by </w:t>
-      </w:r>
-      <w:proofErr w:type="spellStart"/>
-      <w:r>
-        <w:t>Marketea</w:t>
-      </w:r>
-      <w:proofErr w:type="spellEnd"/>
-      <w:r>
-        <w:t>.</w:t>
-      </w:r>
-    </w:p>
-    <w:p>
-      <w:r>
-        <w:lastRenderedPageBreak/>
-        <w:pict w14:anchorId="61C3C681">
-          <v:rect id="_x0000_i1073" style="width:0;height:1.5pt" o:hralign="center" o:hrstd="t" o:hr="t" fillcolor="#a0a0a0" stroked="f"/>
-        </w:pict>
-      </w:r>
-    </w:p>
-    <w:p>
-      <w:pPr>
-        <w:rPr>
-          <w:b/>
-          <w:bCs/>
-        </w:rPr>
-      </w:pPr>
-      <w:r>
-        <w:rPr>
-          <w:b/>
-          <w:bCs/>
-        </w:rPr>
-        <w:t>AZTECA MEXICAN RESTAURANTS (Washington State)</w:t>
-      </w:r>
-    </w:p>
-    <w:p>
-      <w:pPr>
-        <w:rPr>
-          <w:b/>
-          <w:bCs/>
-        </w:rPr>
-      </w:pPr>
-      <w:r>
-        <w:rPr>
-          <w:b/>
-          <w:bCs/>
-        </w:rPr>
-        <w:t>About the Company</w:t>
-      </w:r>
-    </w:p>
-    <w:p>
-      <w:pPr>
-        <w:numPr>
-          <w:ilvl w:val="0"/>
-          <w:numId w:val="34"/>
-        </w:numPr>
-      </w:pPr>
-      <w:r>
-        <w:t xml:space="preserve">Authentic Mexican cuisine: salads, soups, burritos, enchiladas, fajitas, </w:t>
-      </w:r>
-      <w:proofErr w:type="gramStart"/>
-      <w:r>
-        <w:t>kids</w:t>
-      </w:r>
-      <w:proofErr w:type="gramEnd"/>
-      <w:r>
-        <w:t xml:space="preserve"> menu.</w:t>
-      </w:r>
-    </w:p>
-    <w:p>
-      <w:pPr>
-        <w:numPr>
-          <w:ilvl w:val="0"/>
-          <w:numId w:val="34"/>
-        </w:numPr>
-      </w:pPr>
-      <w:r>
-        <w:t>Warm Hacienda-style atmosphere.</w:t>
-      </w:r>
-    </w:p>
-    <w:p>
-      <w:pPr>
-        <w:numPr>
-          <w:ilvl w:val="0"/>
-          <w:numId w:val="34"/>
-        </w:numPr>
-      </w:pPr>
-      <w:r>
-        <w:t>Mission centered on hospitality, love, and Mexican traditions.</w:t>
-      </w:r>
-    </w:p>
-    <w:p>
-      <w:pPr>
-        <w:numPr>
-          <w:ilvl w:val="0"/>
-          <w:numId w:val="34"/>
-        </w:numPr>
-      </w:pPr>
-      <w:r>
-        <w:t>Operating for 50 years.</w:t>
-      </w:r>
-    </w:p>
-    <w:p>
-      <w:pPr>
-        <w:numPr>
-          <w:ilvl w:val="0"/>
-          <w:numId w:val="34"/>
-        </w:numPr>
-      </w:pPr>
-      <w:r>
-        <w:rPr>
-          <w:b/>
-          <w:bCs/>
-        </w:rPr>
-        <w:t>Corporate mailing address:</w:t>
-      </w:r>
-      <w:r>
-        <w:t xml:space="preserve"> 15735 </w:t>
-      </w:r>
-      <w:proofErr w:type="spellStart"/>
-      <w:r>
-        <w:t>Ambaum</w:t>
-      </w:r>
-      <w:proofErr w:type="spellEnd"/>
-      <w:r>
-        <w:t xml:space="preserve"> Blvd SW, Burien, WA 98166.</w:t>
-      </w:r>
-    </w:p>
-    <w:p>
-      <w:pPr>
-        <w:rPr>
-          <w:b/>
-          <w:bCs/>
-        </w:rPr>
-      </w:pPr>
-      <w:r>
-        <w:rPr>
-          <w:b/>
-          <w:bCs/>
-        </w:rPr>
-        <w:t>Menu Highlights</w:t>
-      </w:r>
-    </w:p>
-    <w:p>
-      <w:pPr>
-        <w:rPr>
-          <w:b/>
-          <w:bCs/>
-        </w:rPr>
-      </w:pPr>
-      <w:r>
-        <w:rPr>
-          <w:b/>
-          <w:bCs/>
-        </w:rPr>
-        <w:t>Tacos</w:t>
-      </w:r>
-    </w:p>
-    <w:p>
-      <w:pPr>
-        <w:numPr>
-          <w:ilvl w:val="0"/>
-          <w:numId w:val="35"/>
-        </w:numPr>
-      </w:pPr>
-      <w:r>
-        <w:t>Tacos al Pastor</w:t>
-      </w:r>
-    </w:p>
-    <w:p>
-      <w:pPr>
-        <w:numPr>
-          <w:ilvl w:val="0"/>
-          <w:numId w:val="35"/>
-        </w:numPr>
-      </w:pPr>
-      <w:r>
-        <w:t xml:space="preserve">Tacos </w:t>
-      </w:r>
-      <w:proofErr w:type="spellStart"/>
-      <w:r>
-        <w:t>Auténticos</w:t>
-      </w:r>
-      <w:proofErr w:type="spellEnd"/>
-      <w:r>
-        <w:t xml:space="preserve"> (chicken or steak)</w:t>
-      </w:r>
-    </w:p>
-    <w:p>
-      <w:pPr>
-        <w:numPr>
-          <w:ilvl w:val="0"/>
-          <w:numId w:val="35"/>
-        </w:numPr>
-      </w:pPr>
-      <w:r>
-        <w:t>Fish Tacos</w:t>
-      </w:r>
-    </w:p>
-    <w:p>
-      <w:pPr>
-        <w:numPr>
-          <w:ilvl w:val="0"/>
-          <w:numId w:val="35"/>
-        </w:numPr>
-      </w:pPr>
-      <w:r>
-        <w:t>Carnitas Tacos</w:t>
-      </w:r>
-    </w:p>
-    <w:p>
-      <w:pPr>
-        <w:numPr>
-          <w:ilvl w:val="0"/>
-          <w:numId w:val="35"/>
-        </w:numPr>
-      </w:pPr>
-      <w:r>
-        <w:t>Shrimp Tacos</w:t>
-      </w:r>
-    </w:p>
-    <w:p>
-      <w:pPr>
-        <w:numPr>
-          <w:ilvl w:val="0"/>
-          <w:numId w:val="35"/>
-        </w:numPr>
-      </w:pPr>
-      <w:r>
-        <w:t>Tacos al Carbon</w:t>
-      </w:r>
-    </w:p>
-    <w:p>
-      <w:pPr>
-        <w:rPr>
-          <w:b/>
-          <w:bCs/>
-        </w:rPr>
-      </w:pPr>
-      <w:r>
-        <w:rPr>
-          <w:b/>
-          <w:bCs/>
-        </w:rPr>
-        <w:t>Burritos</w:t>
-      </w:r>
-    </w:p>
-    <w:p>
-      <w:pPr>
-        <w:numPr>
-          <w:ilvl w:val="0"/>
-          <w:numId w:val="36"/>
-        </w:numPr>
-      </w:pPr>
-      <w:r>
-        <w:t>Burrito Blanco</w:t>
-      </w:r>
-    </w:p>
-    <w:p>
-      <w:pPr>
-        <w:numPr>
-          <w:ilvl w:val="0"/>
-          <w:numId w:val="36"/>
-        </w:numPr>
-      </w:pPr>
-      <w:r>
-        <w:t>Macho Burrito</w:t>
-      </w:r>
-    </w:p>
-    <w:p>
-      <w:pPr>
-        <w:numPr>
-          <w:ilvl w:val="0"/>
-          <w:numId w:val="36"/>
-        </w:numPr>
-      </w:pPr>
-      <w:r>
-        <w:t>Fajita Burrito</w:t>
-      </w:r>
-    </w:p>
-    <w:p>
-      <w:pPr>
-        <w:numPr>
-          <w:ilvl w:val="0"/>
-          <w:numId w:val="36"/>
-        </w:numPr>
-      </w:pPr>
-      <w:r>
-        <w:t>Burrito Dos Amigos</w:t>
-      </w:r>
-    </w:p>
-    <w:p>
-      <w:pPr>
-        <w:numPr>
-          <w:ilvl w:val="0"/>
-          <w:numId w:val="36"/>
-        </w:numPr>
-      </w:pPr>
-      <w:r>
-        <w:t>Carne Asada Burrito</w:t>
-      </w:r>
-    </w:p>
-    <w:p>
-      <w:pPr>
-        <w:rPr>
-          <w:b/>
-          <w:bCs/>
-        </w:rPr>
-      </w:pPr>
-      <w:r>
-        <w:rPr>
-          <w:b/>
-          <w:bCs/>
-        </w:rPr>
-        <w:t>Additional Services</w:t>
-      </w:r>
-    </w:p>
-    <w:p>
-      <w:pPr>
-        <w:numPr>
-          <w:ilvl w:val="0"/>
-          <w:numId w:val="37"/>
-        </w:numPr>
-      </w:pPr>
-      <w:r>
-        <w:t>Catering</w:t>
-      </w:r>
-    </w:p>
-    <w:p>
-      <w:pPr>
-        <w:numPr>
-          <w:ilvl w:val="0"/>
-          <w:numId w:val="37"/>
-        </w:numPr>
-      </w:pPr>
-      <w:r>
-        <w:t>Gift cards</w:t>
-      </w:r>
-    </w:p>
-    <w:p>
-      <w:pPr>
-        <w:numPr>
-          <w:ilvl w:val="0"/>
-          <w:numId w:val="37"/>
-        </w:numPr>
-      </w:pPr>
-      <w:r>
-        <w:t>VIP club</w:t>
-      </w:r>
-    </w:p>
-    <w:p>
-      <w:pPr>
-        <w:numPr>
-          <w:ilvl w:val="0"/>
-          <w:numId w:val="37"/>
-        </w:numPr>
-      </w:pPr>
-      <w:r>
-        <w:lastRenderedPageBreak/>
-        <w:t>Online ordering (location-based pricing)</w:t>
-      </w:r>
-    </w:p>
-    <w:p>
-      <w:r>
-        <w:pict w14:anchorId="2EA32A44">
-          <v:rect id="_x0000_i1074" style="width:0;height:1.5pt" o:hralign="center" o:hrstd="t" o:hr="t" fillcolor="#a0a0a0" stroked="f"/>
-        </w:pict>
-      </w:r>
-    </w:p>
-    <w:p>
-      <w:pPr>
-        <w:rPr>
-          <w:b/>
-          <w:bCs/>
-        </w:rPr>
-      </w:pPr>
-      <w:r>
-        <w:rPr>
-          <w:b/>
-          <w:bCs/>
-        </w:rPr>
-        <w:t>Locations (Washington State)</w:t>
-      </w:r>
-    </w:p>
-    <w:p>
-      <w:pPr>
-        <w:rPr>
-          <w:b/>
-          <w:bCs/>
-        </w:rPr>
-      </w:pPr>
-      <w:r>
-        <w:rPr>
-          <w:b/>
-          <w:bCs/>
-        </w:rPr>
-        <w:t>Azteca Restaurants</w:t>
-      </w:r>
-    </w:p>
-    <w:p>
-      <w:pPr>
-        <w:numPr>
-          <w:ilvl w:val="0"/>
-          <w:numId w:val="38"/>
-        </w:numPr>
-      </w:pPr>
-      <w:r>
-        <w:rPr>
-          <w:b/>
-          <w:bCs/>
-        </w:rPr>
-        <w:t>Burien</w:t>
-      </w:r>
-      <w:r>
-        <w:t xml:space="preserve"> – 153 SW 157th St, Burien, WA 98166 — Phone: (206) 243-2241</w:t>
-      </w:r>
-    </w:p>
-    <w:p>
-      <w:pPr>
-        <w:numPr>
-          <w:ilvl w:val="0"/>
-          <w:numId w:val="38"/>
-        </w:numPr>
-      </w:pPr>
-      <w:r>
-        <w:rPr>
-          <w:b/>
-          <w:bCs/>
-        </w:rPr>
-        <w:t>Federal Way</w:t>
-      </w:r>
-      <w:r>
-        <w:t xml:space="preserve"> – 2020 S 320th St, Federal Way, WA 98003 — Phone: (253) 839-6693</w:t>
-      </w:r>
-    </w:p>
-    <w:p>
-      <w:pPr>
-        <w:numPr>
-          <w:ilvl w:val="0"/>
-          <w:numId w:val="38"/>
-        </w:numPr>
-      </w:pPr>
-      <w:r>
-        <w:rPr>
-          <w:b/>
-          <w:bCs/>
-        </w:rPr>
-        <w:t>Kirkland</w:t>
-      </w:r>
-      <w:r>
-        <w:t xml:space="preserve"> – 11431 NE 124th St, Kirkland, WA 98034 — Phone: (425) 820-7997</w:t>
-      </w:r>
-    </w:p>
-    <w:p>
-      <w:pPr>
-        <w:numPr>
-          <w:ilvl w:val="0"/>
-          <w:numId w:val="38"/>
-        </w:numPr>
-      </w:pPr>
-      <w:r>
-        <w:rPr>
-          <w:b/>
-          <w:bCs/>
-        </w:rPr>
-        <w:t>Kent</w:t>
-      </w:r>
-      <w:r>
-        <w:t xml:space="preserve"> – 25633 102nd Pl SE, Kent, WA 98030 — Phone: (253) 852-0210</w:t>
-      </w:r>
-    </w:p>
-    <w:p>
-      <w:pPr>
-        <w:numPr>
-          <w:ilvl w:val="0"/>
-          <w:numId w:val="38"/>
-        </w:numPr>
-      </w:pPr>
-      <w:r>
-        <w:rPr>
-          <w:b/>
-          <w:bCs/>
-        </w:rPr>
-        <w:t>Mill Creek</w:t>
-      </w:r>
-      <w:r>
-        <w:t xml:space="preserve"> – 15704 Mill Creek Blvd, Mill Creek, WA 98012 — Phone: (425) 385-2209</w:t>
-      </w:r>
-    </w:p>
-    <w:p>
-      <w:pPr>
-        <w:numPr>
-          <w:ilvl w:val="0"/>
-          <w:numId w:val="38"/>
-        </w:numPr>
-      </w:pPr>
-      <w:r>
-        <w:rPr>
-          <w:b/>
-          <w:bCs/>
-        </w:rPr>
-        <w:t>Mountlake Terrace</w:t>
-      </w:r>
-      <w:r>
-        <w:t xml:space="preserve"> – 22003 66th Ave W, Mountlake Terrace, WA 98043 — Phone: (425) 672-0601</w:t>
-      </w:r>
-    </w:p>
-    <w:p>
-      <w:pPr>
-        <w:numPr>
-          <w:ilvl w:val="0"/>
-          <w:numId w:val="38"/>
-        </w:numPr>
-      </w:pPr>
-      <w:r>
-        <w:rPr>
-          <w:b/>
-          <w:bCs/>
-        </w:rPr>
-        <w:t>Mukilteo</w:t>
-      </w:r>
-      <w:r>
-        <w:t xml:space="preserve"> – 11811 Mukilteo Speedway Suite 100, Mukilteo, WA 98275 — Phone: (425) 438-1414</w:t>
-      </w:r>
-    </w:p>
-    <w:p>
-      <w:pPr>
-        <w:numPr>
-          <w:ilvl w:val="0"/>
-          <w:numId w:val="38"/>
-        </w:numPr>
-      </w:pPr>
-      <w:r>
-        <w:rPr>
-          <w:b/>
-          <w:bCs/>
-        </w:rPr>
-        <w:t>Silverdale</w:t>
-      </w:r>
-      <w:r>
-        <w:t xml:space="preserve"> – 2936 Bucklin Hill Rd, Silverdale, WA 98383 — Phone: (360) 698-2200</w:t>
-      </w:r>
-    </w:p>
-    <w:p>
-      <w:pPr>
-        <w:numPr>
-          <w:ilvl w:val="0"/>
-          <w:numId w:val="38"/>
-        </w:numPr>
-      </w:pPr>
-      <w:r>
-        <w:rPr>
-          <w:b/>
-          <w:bCs/>
-        </w:rPr>
-        <w:t>Kennewick</w:t>
-      </w:r>
-      <w:r>
-        <w:t xml:space="preserve"> – 6505 W Canal Dr, Kennewick, WA 99336 — Phone: (509) 735-6661</w:t>
-      </w:r>
-    </w:p>
-    <w:p>
-      <w:pPr>
-        <w:numPr>
-          <w:ilvl w:val="0"/>
-          <w:numId w:val="38"/>
-        </w:numPr>
-      </w:pPr>
-      <w:r>
-        <w:rPr>
-          <w:b/>
-          <w:bCs/>
-        </w:rPr>
-        <w:t>Spokane Valley</w:t>
-      </w:r>
-      <w:r>
-        <w:t xml:space="preserve"> – 14700 E Indiana St Suite 1080, Spokane, WA 99216 — Phone: (509) 228-9661</w:t>
-      </w:r>
-    </w:p>
-    <w:p>
-      <w:pPr>
-        <w:numPr>
-          <w:ilvl w:val="0"/>
-          <w:numId w:val="38"/>
-        </w:numPr>
-      </w:pPr>
-      <w:r>
-        <w:rPr>
-          <w:b/>
-          <w:bCs/>
-        </w:rPr>
-        <w:t>Southcenter / Tukwila</w:t>
-      </w:r>
-      <w:r>
-        <w:t xml:space="preserve"> – 17555 Southcenter Pkwy, Tukwila, WA 98188 — Phone: (206) 575-0990</w:t>
-      </w:r>
-    </w:p>
-    <w:p>
-      <w:pPr>
-        <w:rPr>
-          <w:b/>
-          <w:bCs/>
-        </w:rPr>
-      </w:pPr>
-      <w:r>
-        <w:rPr>
-          <w:b/>
-          <w:bCs/>
-        </w:rPr>
-        <w:t>Casa Ramos</w:t>
-      </w:r>
-    </w:p>
-    <w:p>
-      <w:pPr>
-        <w:numPr>
-          <w:ilvl w:val="0"/>
-          <w:numId w:val="39"/>
-        </w:numPr>
-      </w:pPr>
-      <w:r>
-        <w:rPr>
-          <w:b/>
-          <w:bCs/>
-        </w:rPr>
-        <w:t>Centralia</w:t>
-      </w:r>
-      <w:r>
-        <w:t xml:space="preserve"> – 929 Harrison St, Centralia, WA 98531 — Phone: (360) 330-2045</w:t>
-      </w:r>
-    </w:p>
-    <w:p>
-      <w:r>
-        <w:pict w14:anchorId="44993FA8">
-          <v:rect id="_x0000_i1075" style="width:0;height:1.5pt" o:hralign="center" o:hrstd="t" o:hr="t" fillcolor="#a0a0a0" stroked="f"/>
-        </w:pict>
-      </w:r>
-    </w:p>
-    <w:p>
-      <w:pPr>
-        <w:rPr>
-          <w:b/>
-          <w:bCs/>
-        </w:rPr>
-      </w:pPr>
-      <w:r>
-        <w:rPr>
-          <w:b/>
-          <w:bCs/>
-        </w:rPr>
-        <w:t>Catering (Azteca)</w:t>
-      </w:r>
-    </w:p>
-    <w:p>
-      <w:pPr>
-        <w:rPr>
-          <w:b/>
-          <w:bCs/>
-        </w:rPr>
-      </w:pPr>
-      <w:r>
-        <w:rPr>
-          <w:b/>
-          <w:bCs/>
-        </w:rPr>
-        <w:t>Fiesta Platter</w:t>
-      </w:r>
-    </w:p>
-    <w:p>
-      <w:pPr>
-        <w:numPr>
-          <w:ilvl w:val="0"/>
-          <w:numId w:val="40"/>
-        </w:numPr>
-      </w:pPr>
-      <w:r>
-        <w:t>Mini chimichangas, quesadillas, picadillo flautas, taquitos, chicken taquitos</w:t>
-      </w:r>
-    </w:p>
-    <w:p>
-      <w:pPr>
-        <w:numPr>
-          <w:ilvl w:val="0"/>
-          <w:numId w:val="40"/>
-        </w:numPr>
-      </w:pPr>
-      <w:r>
-        <w:t xml:space="preserve">Includes sour cream, guacamole, </w:t>
-      </w:r>
-      <w:proofErr w:type="spellStart"/>
-      <w:r>
-        <w:t>pico</w:t>
-      </w:r>
-      <w:proofErr w:type="spellEnd"/>
-      <w:r>
-        <w:t xml:space="preserve"> de </w:t>
-      </w:r>
-      <w:proofErr w:type="spellStart"/>
-      <w:r>
-        <w:t>gallo</w:t>
-      </w:r>
-      <w:proofErr w:type="spellEnd"/>
-      <w:r>
-        <w:t>, chips, salsa</w:t>
-      </w:r>
-    </w:p>
-    <w:p>
-      <w:pPr>
-        <w:rPr>
-          <w:b/>
-          <w:bCs/>
-        </w:rPr>
-      </w:pPr>
-      <w:r>
-        <w:rPr>
-          <w:b/>
-          <w:bCs/>
-        </w:rPr>
-        <w:t>Vegetarian Fiesta Platter</w:t>
-      </w:r>
-    </w:p>
-    <w:p>
-      <w:pPr>
-        <w:numPr>
-          <w:ilvl w:val="0"/>
-          <w:numId w:val="41"/>
-        </w:numPr>
-      </w:pPr>
-      <w:r>
-        <w:lastRenderedPageBreak/>
-        <w:t>Cheese &amp; veggie quesadillas, spinach flautas, bean mini chimichangas</w:t>
-      </w:r>
-    </w:p>
-    <w:p>
-      <w:pPr>
-        <w:numPr>
-          <w:ilvl w:val="0"/>
-          <w:numId w:val="41"/>
-        </w:numPr>
-      </w:pPr>
-      <w:r>
-        <w:t xml:space="preserve">Includes ranch/blue cheese, sour cream, guacamole, </w:t>
-      </w:r>
-      <w:proofErr w:type="spellStart"/>
-      <w:r>
-        <w:t>pico</w:t>
-      </w:r>
-      <w:proofErr w:type="spellEnd"/>
-      <w:r>
-        <w:t xml:space="preserve"> de </w:t>
-      </w:r>
-      <w:proofErr w:type="spellStart"/>
-      <w:r>
-        <w:t>gallo</w:t>
-      </w:r>
-      <w:proofErr w:type="spellEnd"/>
-      <w:r>
-        <w:t>, chips, salsa</w:t>
-      </w:r>
-    </w:p>
-    <w:p>
-      <w:pPr>
-        <w:rPr>
-          <w:b/>
-          <w:bCs/>
-        </w:rPr>
-      </w:pPr>
-      <w:r>
-        <w:rPr>
-          <w:b/>
-          <w:bCs/>
-        </w:rPr>
-        <w:t>Burrito Finger Platter</w:t>
-      </w:r>
-    </w:p>
-    <w:p>
-      <w:pPr>
-        <w:numPr>
-          <w:ilvl w:val="0"/>
-          <w:numId w:val="42"/>
-        </w:numPr>
-      </w:pPr>
-      <w:r>
-        <w:t>Mini chicken burritos</w:t>
-      </w:r>
-    </w:p>
-    <w:p>
-      <w:pPr>
-        <w:numPr>
-          <w:ilvl w:val="0"/>
-          <w:numId w:val="42"/>
-        </w:numPr>
-      </w:pPr>
-      <w:r>
-        <w:t>Mini picadillo burritos</w:t>
-      </w:r>
-    </w:p>
-    <w:p>
-      <w:pPr>
-        <w:numPr>
-          <w:ilvl w:val="0"/>
-          <w:numId w:val="42"/>
-        </w:numPr>
-      </w:pPr>
-      <w:r>
-        <w:t>Served with toppings and chips</w:t>
-      </w:r>
-    </w:p>
-    <w:p>
-      <w:pPr>
-        <w:numPr>
-          <w:ilvl w:val="0"/>
-          <w:numId w:val="42"/>
-        </w:numPr>
-      </w:pPr>
-      <w:r>
-        <w:t>Feeds 8–10</w:t>
-      </w:r>
-    </w:p>
-    <w:p>
-      <w:pPr>
-        <w:rPr>
-          <w:b/>
-          <w:bCs/>
-        </w:rPr>
-      </w:pPr>
-      <w:r>
-        <w:rPr>
-          <w:b/>
-          <w:bCs/>
-        </w:rPr>
-        <w:t>Party Packs</w:t>
-      </w:r>
-    </w:p>
-    <w:p>
-      <w:pPr>
-        <w:numPr>
-          <w:ilvl w:val="0"/>
-          <w:numId w:val="43"/>
-        </w:numPr>
-      </w:pPr>
-      <w:r>
-        <w:t>Quesadilla Platter (48 slices)</w:t>
-      </w:r>
-    </w:p>
-    <w:p>
-      <w:pPr>
-        <w:numPr>
-          <w:ilvl w:val="0"/>
-          <w:numId w:val="43"/>
-        </w:numPr>
-      </w:pPr>
-      <w:r>
-        <w:t>Combo Party Platter (taquitos + burritos)</w:t>
-      </w:r>
-    </w:p>
-    <w:p>
-      <w:pPr>
-        <w:numPr>
-          <w:ilvl w:val="0"/>
-          <w:numId w:val="43"/>
-        </w:numPr>
-      </w:pPr>
-      <w:r>
-        <w:t>Layered Bean Dip (feeds 25)</w:t>
-      </w:r>
-    </w:p>
-    <w:p>
-      <w:pPr>
-        <w:numPr>
-          <w:ilvl w:val="0"/>
-          <w:numId w:val="43"/>
-        </w:numPr>
-      </w:pPr>
-      <w:r>
-        <w:t>Fresh Guacamole with Chips (feeds 10)</w:t>
-      </w:r>
-    </w:p>
-    <w:p>
-      <w:pPr>
-        <w:rPr>
-          <w:b/>
-          <w:bCs/>
-        </w:rPr>
-      </w:pPr>
-      <w:r>
-        <w:rPr>
-          <w:b/>
-          <w:bCs/>
-        </w:rPr>
-        <w:t>Buffet-Style Catering (20-person minimum)</w:t>
-      </w:r>
-    </w:p>
-    <w:p>
-      <w:pPr>
-        <w:numPr>
-          <w:ilvl w:val="0"/>
-          <w:numId w:val="44"/>
-        </w:numPr>
-      </w:pPr>
-      <w:r>
-        <w:t>Fajita Bar</w:t>
-      </w:r>
-    </w:p>
-    <w:p>
-      <w:pPr>
-        <w:numPr>
-          <w:ilvl w:val="0"/>
-          <w:numId w:val="44"/>
-        </w:numPr>
-      </w:pPr>
-      <w:r>
-        <w:t>Taco Bar</w:t>
-      </w:r>
-    </w:p>
-    <w:p>
-      <w:pPr>
-        <w:numPr>
-          <w:ilvl w:val="0"/>
-          <w:numId w:val="44"/>
-        </w:numPr>
-      </w:pPr>
-      <w:r>
-        <w:t>Enchilada Bar</w:t>
-      </w:r>
-    </w:p>
-    <w:p>
-      <w:r>
-        <w:pict w14:anchorId="462BD869">
-          <v:rect id="_x0000_i1076" style="width:0;height:1.5pt" o:hralign="center" o:hrstd="t" o:hr="t" fillcolor="#a0a0a0" stroked="f"/>
-        </w:pict>
-      </w:r>
-    </w:p>
-    <w:p>
-      <w:pPr>
-        <w:rPr>
-          <w:b/>
-          <w:bCs/>
-        </w:rPr>
-      </w:pPr>
-      <w:r>
-        <w:rPr>
-          <w:b/>
-          <w:bCs/>
-        </w:rPr>
-        <w:t>Gift Cards</w:t>
-      </w:r>
-    </w:p>
-    <w:p>
-      <w:pPr>
-        <w:numPr>
-          <w:ilvl w:val="0"/>
-          <w:numId w:val="45"/>
-        </w:numPr>
-      </w:pPr>
-      <w:r>
-        <w:t>Redeemable only at Azteca restaurants in Washington.</w:t>
-      </w:r>
-    </w:p>
-    <w:p>
-      <w:pPr>
-        <w:numPr>
-          <w:ilvl w:val="0"/>
-          <w:numId w:val="45"/>
-        </w:numPr>
-      </w:pPr>
-      <w:r>
-        <w:t>Physical cards only (no e-cards).</w:t>
-      </w:r>
-    </w:p>
-    <w:p>
-      <w:pPr>
-        <w:numPr>
-          <w:ilvl w:val="0"/>
-          <w:numId w:val="45"/>
-        </w:numPr>
-      </w:pPr>
-      <w:r>
-        <w:t>Available amounts: $10, $25, $50, $75, $100.</w:t>
-      </w:r>
-    </w:p>
-    <w:p>
-      <w:r>
-        <w:pict w14:anchorId="1B1A1FD2">
-          <v:rect id="_x0000_i1077" style="width:0;height:1.5pt" o:hralign="center" o:hrstd="t" o:hr="t" fillcolor="#a0a0a0" stroked="f"/>
-        </w:pict>
-      </w:r>
-    </w:p>
-    <w:p>
-      <w:pPr>
-        <w:rPr>
-          <w:b/>
-          <w:bCs/>
-        </w:rPr>
-      </w:pPr>
-      <w:r>
-        <w:rPr>
-          <w:b/>
-          <w:bCs/>
-        </w:rPr>
-        <w:t>Customer Feedback</w:t>
-      </w:r>
-    </w:p>
-    <w:p>
-      <w:pPr>
-        <w:numPr>
-          <w:ilvl w:val="0"/>
-          <w:numId w:val="46"/>
-        </w:numPr>
-      </w:pPr>
-      <w:r>
-        <w:t>Feedback categories: general comment, catering info, donation request, menu info, reservation request, issue report.</w:t>
-      </w:r>
-    </w:p>
-    <w:p>
-      <w:r>
-        <w:pict w14:anchorId="54436F70">
-          <v:rect id="_x0000_i1078" style="width:0;height:1.5pt" o:hralign="center" o:hrstd="t" o:hr="t" fillcolor="#a0a0a0" stroked="f"/>
-        </w:pict>
-      </w:r>
-    </w:p>
-    <w:p>
-      <w:pPr>
-        <w:rPr>
-          <w:b/>
-          <w:bCs/>
-        </w:rPr>
-      </w:pPr>
-      <w:r>
-        <w:rPr>
-          <w:b/>
-          <w:bCs/>
-        </w:rPr>
-        <w:lastRenderedPageBreak/>
-        <w:t>Company History</w:t>
-      </w:r>
-    </w:p>
-    <w:p>
-      <w:pPr>
-        <w:numPr>
-          <w:ilvl w:val="0"/>
-          <w:numId w:val="47"/>
-        </w:numPr>
-      </w:pPr>
-      <w:r>
-        <w:t>Founded by Jose “Pepe” Ramos in 1974 in Burien, WA.</w:t>
-      </w:r>
-    </w:p>
-    <w:p>
-      <w:pPr>
-        <w:numPr>
-          <w:ilvl w:val="0"/>
-          <w:numId w:val="47"/>
-        </w:numPr>
-      </w:pPr>
-      <w:r>
-        <w:t>Inspired by family recipes from Jalisco, Mexico.</w:t>
-      </w:r>
-    </w:p>
-    <w:p>
-      <w:pPr>
-        <w:numPr>
-          <w:ilvl w:val="0"/>
-          <w:numId w:val="47"/>
-        </w:numPr>
-      </w:pPr>
-      <w:r>
-        <w:t>Grew from a 24-seat restaurant to a multi-location chain.</w:t>
-      </w:r>
-    </w:p>
-    <w:p>
-      <w:pPr>
-        <w:numPr>
-          <w:ilvl w:val="0"/>
-          <w:numId w:val="47"/>
-        </w:numPr>
-      </w:pPr>
-      <w:r>
-        <w:t>Core philosophy: good food at reasonable prices + strong employee care.</w:t>
-      </w:r>
-    </w:p>
-    <w:p>
-      <w:r>
-        <w:pict w14:anchorId="3A1705B6">
-          <v:rect id="_x0000_i1079" style="width:0;height:1.5pt" o:hralign="center" o:hrstd="t" o:hr="t" fillcolor="#a0a0a0" stroked="f"/>
-        </w:pict>
-      </w:r>
-    </w:p>
-    <w:p>
-      <w:pPr>
-        <w:rPr>
-          <w:b/>
-          <w:bCs/>
-        </w:rPr>
-      </w:pPr>
-      <w:r>
-        <w:rPr>
-          <w:b/>
-          <w:bCs/>
-        </w:rPr>
-        <w:t>Awards</w:t>
-      </w:r>
-    </w:p>
-    <w:p>
-      <w:pPr>
-        <w:numPr>
-          <w:ilvl w:val="0"/>
-          <w:numId w:val="48"/>
-        </w:numPr>
-      </w:pPr>
-      <w:r>
-        <w:t>Best Overall Restaurant</w:t>
-      </w:r>
-    </w:p>
-    <w:p>
-      <w:pPr>
-        <w:numPr>
-          <w:ilvl w:val="0"/>
-          <w:numId w:val="48"/>
-        </w:numPr>
-      </w:pPr>
-      <w:r>
-        <w:t>Best Mexican Restaurant</w:t>
-      </w:r>
-    </w:p>
-    <w:p>
-      <w:pPr>
-        <w:numPr>
-          <w:ilvl w:val="0"/>
-          <w:numId w:val="48"/>
-        </w:numPr>
-      </w:pPr>
-      <w:r>
-        <w:t>Best Family Dining</w:t>
-      </w:r>
-    </w:p>
-    <w:p>
-      <w:pPr>
-        <w:numPr>
-          <w:ilvl w:val="0"/>
-          <w:numId w:val="48"/>
-        </w:numPr>
-      </w:pPr>
-      <w:r>
-        <w:t>Best Restaurant to Take Kids To</w:t>
-      </w:r>
-    </w:p>
-    <w:p>
-      <w:r>
-        <w:pict w14:anchorId="2042F1C8">
-          <v:rect id="_x0000_i1080" style="width:0;height:1.5pt" o:hralign="center" o:hrstd="t" o:hr="t" fillcolor="#a0a0a0" stroked="f"/>
-        </w:pict>
-      </w:r>
-    </w:p>
-    <w:p>
-      <w:pPr>
-        <w:rPr>
-          <w:b/>
-          <w:bCs/>
-        </w:rPr>
-      </w:pPr>
-      <w:r>
-        <w:rPr>
-          <w:b/>
-          <w:bCs/>
-        </w:rPr>
-        <w:t>VIP Club</w:t>
-      </w:r>
-    </w:p>
-    <w:p>
-      <w:pPr>
-        <w:numPr>
-          <w:ilvl w:val="0"/>
-          <w:numId w:val="49"/>
-        </w:numPr>
-      </w:pPr>
-      <w:r>
-        <w:t>Every 10th check-in earns 20% or $10 off a food purchase of $20 or more.</w:t>
-      </w:r>
-    </w:p>
-    <w:p/>
     <w:sectPr>
       <w:pgSz w:w="12240" w:h="15840"/>
       <w:pgMar w:top="1440" w:right="1440" w:bottom="1440" w:left="1440" w:header="720" w:footer="720" w:gutter="0"/>
@@ -9588,6 +8075,7 @@
   <w:style w:type="character" w:default="1" w:styleId="DefaultParagraphFont">
     <w:name w:val="Default Paragraph Font"/>
     <w:uiPriority w:val="1"/>
+    <w:semiHidden/>
     <w:unhideWhenUsed/>
   </w:style>
   <w:style w:type="table" w:default="1" w:styleId="TableNormal">

</xml_diff>